<commit_message>
ark: intelligence brief 2026-02 + source update
</commit_message>
<xml_diff>
--- a/out/ark/ark-intelligence-brief-2026-02.docx
+++ b/out/ark/ark-intelligence-brief-2026-02.docx
@@ -113,7 +113,7 @@
           <w:sz w:val="21"/>
           <w:u w:val="none"/>
         </w:rPr>
-        <w:t>No specific grants, policy changes, or company names available for February 2026.</w:t>
+        <w:t>No specific grant amounts, policy changes, or company names were retrieved.</w:t>
       </w:r>
     </w:p>
     <w:p>
@@ -130,7 +130,7 @@
           <w:sz w:val="21"/>
           <w:u w:val="none"/>
         </w:rPr>
-        <w:t>No specific grants, policy changes, or company names available for February 2026.</w:t>
+        <w:t>No specific grant amounts, policy changes, or company names were retrieved.</w:t>
       </w:r>
     </w:p>
     <w:p>
@@ -147,7 +147,7 @@
           <w:sz w:val="21"/>
           <w:u w:val="none"/>
         </w:rPr>
-        <w:t>No specific grants, policy changes, or company names available for February 2026.</w:t>
+        <w:t>No specific grant amounts, policy changes, or company names were retrieved.</w:t>
       </w:r>
     </w:p>
     <w:p>

</xml_diff>

<commit_message>
ark: intelligence brief 2026-02 + baseline update
</commit_message>
<xml_diff>
--- a/out/ark/ark-intelligence-brief-2026-02.docx
+++ b/out/ark/ark-intelligence-brief-2026-02.docx
@@ -402,6 +402,19 @@
         </w:rPr>
         <w:t>ARENA — Industrial Transformation Stream (ITS) Round 3</w:t>
       </w:r>
+      <w:r>
+        <w:t xml:space="preserve">  </w:t>
+      </w:r>
+      <w:r>
+        <w:rPr>
+          <w:rFonts w:ascii="Calibri" w:hAnsi="Calibri"/>
+          <w:b/>
+          <w:sz w:val="16"/>
+          <w:shd w:val="clear" w:color="auto" w:fill="1B7A6B"/>
+          <w:color w:val="FFFFFF"/>
+        </w:rPr>
+        <w:t xml:space="preserve">  OPEN | ROLLING  </w:t>
+      </w:r>
     </w:p>
     <w:p>
       <w:pPr>
@@ -473,6 +486,19 @@
         </w:rPr>
         <w:t>Emissions Reduction Fund / ACCU Scheme</w:t>
       </w:r>
+      <w:r>
+        <w:t xml:space="preserve">  </w:t>
+      </w:r>
+      <w:r>
+        <w:rPr>
+          <w:rFonts w:ascii="Calibri" w:hAnsi="Calibri"/>
+          <w:b/>
+          <w:sz w:val="16"/>
+          <w:shd w:val="clear" w:color="auto" w:fill="0D2D4A"/>
+          <w:color w:val="FFFFFF"/>
+        </w:rPr>
+        <w:t xml:space="preserve">  REVENUE MECHANISM  </w:t>
+      </w:r>
     </w:p>
     <w:p>
       <w:pPr>
@@ -562,6 +588,19 @@
         </w:rPr>
         <w:t>Clean Energy Finance Corporation (CEFC)</w:t>
       </w:r>
+      <w:r>
+        <w:t xml:space="preserve">  </w:t>
+      </w:r>
+      <w:r>
+        <w:rPr>
+          <w:rFonts w:ascii="Calibri" w:hAnsi="Calibri"/>
+          <w:b/>
+          <w:sz w:val="16"/>
+          <w:shd w:val="clear" w:color="auto" w:fill="0D2D4A"/>
+          <w:color w:val="FFFFFF"/>
+        </w:rPr>
+        <w:t xml:space="preserve">  CO-INVESTMENT  </w:t>
+      </w:r>
     </w:p>
     <w:p>
       <w:pPr>
@@ -615,6 +654,19 @@
         </w:rPr>
         <w:t>R&amp;D Tax Incentive</w:t>
       </w:r>
+      <w:r>
+        <w:t xml:space="preserve">  </w:t>
+      </w:r>
+      <w:r>
+        <w:rPr>
+          <w:rFonts w:ascii="Calibri" w:hAnsi="Calibri"/>
+          <w:b/>
+          <w:sz w:val="16"/>
+          <w:shd w:val="clear" w:color="auto" w:fill="888888"/>
+          <w:color w:val="FFFFFF"/>
+        </w:rPr>
+        <w:t xml:space="preserve">  TAX INCENTIVE  </w:t>
+      </w:r>
     </w:p>
     <w:p>
       <w:pPr>
@@ -819,6 +871,19 @@
         </w:rPr>
         <w:t>Regulatory Driver — Safeguard Mechanism</w:t>
       </w:r>
+      <w:r>
+        <w:t xml:space="preserve">  </w:t>
+      </w:r>
+      <w:r>
+        <w:rPr>
+          <w:rFonts w:ascii="Calibri" w:hAnsi="Calibri"/>
+          <w:b/>
+          <w:sz w:val="16"/>
+          <w:shd w:val="clear" w:color="auto" w:fill="0D2D4A"/>
+          <w:color w:val="FFFFFF"/>
+        </w:rPr>
+        <w:t xml:space="preserve">  REGULATORY DRIVER  </w:t>
+      </w:r>
     </w:p>
     <w:p>
       <w:pPr>
@@ -944,6 +1009,19 @@
         </w:rPr>
         <w:t>National Climate Targets</w:t>
       </w:r>
+      <w:r>
+        <w:t xml:space="preserve">  </w:t>
+      </w:r>
+      <w:r>
+        <w:rPr>
+          <w:rFonts w:ascii="Calibri" w:hAnsi="Calibri"/>
+          <w:b/>
+          <w:sz w:val="16"/>
+          <w:shd w:val="clear" w:color="auto" w:fill="0D2D4A"/>
+          <w:color w:val="FFFFFF"/>
+        </w:rPr>
+        <w:t xml:space="preserve">  POLICY  </w:t>
+      </w:r>
     </w:p>
     <w:p>
       <w:pPr>
@@ -1015,6 +1093,19 @@
         </w:rPr>
         <w:t>Electricity Prices — Relevance to ARK's Fully-Electric Model</w:t>
       </w:r>
+      <w:r>
+        <w:t xml:space="preserve">  </w:t>
+      </w:r>
+      <w:r>
+        <w:rPr>
+          <w:rFonts w:ascii="Calibri" w:hAnsi="Calibri"/>
+          <w:b/>
+          <w:sz w:val="16"/>
+          <w:shd w:val="clear" w:color="auto" w:fill="1B7A6B"/>
+          <w:color w:val="FFFFFF"/>
+        </w:rPr>
+        <w:t xml:space="preserve">  MARKET DRIVER  </w:t>
+      </w:r>
     </w:p>
     <w:p>
       <w:pPr>
@@ -1104,6 +1195,19 @@
         </w:rPr>
         <w:t>Key Emitting Sectors</w:t>
       </w:r>
+      <w:r>
+        <w:t xml:space="preserve">  </w:t>
+      </w:r>
+      <w:r>
+        <w:rPr>
+          <w:rFonts w:ascii="Calibri" w:hAnsi="Calibri"/>
+          <w:b/>
+          <w:sz w:val="16"/>
+          <w:shd w:val="clear" w:color="auto" w:fill="1B7A6B"/>
+          <w:color w:val="FFFFFF"/>
+        </w:rPr>
+        <w:t xml:space="preserve">  OPPORTUNITY SECTORS  </w:t>
+      </w:r>
     </w:p>
     <w:p>
       <w:pPr>
@@ -1193,6 +1297,19 @@
         </w:rPr>
         <w:t>CCS Storage Infrastructure</w:t>
       </w:r>
+      <w:r>
+        <w:t xml:space="preserve">  </w:t>
+      </w:r>
+      <w:r>
+        <w:rPr>
+          <w:rFonts w:ascii="Calibri" w:hAnsi="Calibri"/>
+          <w:b/>
+          <w:sz w:val="16"/>
+          <w:shd w:val="clear" w:color="auto" w:fill="888888"/>
+          <w:color w:val="FFFFFF"/>
+        </w:rPr>
+        <w:t xml:space="preserve">  INFRASTRUCTURE  </w:t>
+      </w:r>
     </w:p>
     <w:p>
       <w:pPr>
@@ -1415,6 +1532,19 @@
         </w:rPr>
         <w:t>Amine / MEA Post-Combustion Capture</w:t>
       </w:r>
+      <w:r>
+        <w:t xml:space="preserve">  </w:t>
+      </w:r>
+      <w:r>
+        <w:rPr>
+          <w:rFonts w:ascii="Calibri" w:hAnsi="Calibri"/>
+          <w:b/>
+          <w:sz w:val="16"/>
+          <w:shd w:val="clear" w:color="auto" w:fill="888888"/>
+          <w:color w:val="FFFFFF"/>
+        </w:rPr>
+        <w:t xml:space="preserve">  INCUMBENT TECH  </w:t>
+      </w:r>
     </w:p>
     <w:p>
       <w:pPr>
@@ -1485,7 +1615,7 @@
           <w:sz w:val="20"/>
           <w:u w:val="none"/>
         </w:rPr>
-        <w:t>Not commercially deployed for WtE or biomass flue gas in Australia as of March 2026</w:t>
+        <w:t>Not commercially deployed for WtE or biomass flue gas in Australia as of Q1 2026</w:t>
       </w:r>
     </w:p>
     <w:p>
@@ -1503,6 +1633,19 @@
           <w:u w:val="none"/>
         </w:rPr>
         <w:t>Calix / LEILAC — Complementary, Not Competing</w:t>
+      </w:r>
+      <w:r>
+        <w:t xml:space="preserve">  </w:t>
+      </w:r>
+      <w:r>
+        <w:rPr>
+          <w:rFonts w:ascii="Calibri" w:hAnsi="Calibri"/>
+          <w:b/>
+          <w:sz w:val="16"/>
+          <w:shd w:val="clear" w:color="auto" w:fill="1B7A6B"/>
+          <w:color w:val="FFFFFF"/>
+        </w:rPr>
+        <w:t xml:space="preserve">  COMPLEMENTARY  </w:t>
       </w:r>
     </w:p>
     <w:p>
@@ -1611,6 +1754,19 @@
         </w:rPr>
         <w:t>Membrane Separation</w:t>
       </w:r>
+      <w:r>
+        <w:t xml:space="preserve">  </w:t>
+      </w:r>
+      <w:r>
+        <w:rPr>
+          <w:rFonts w:ascii="Calibri" w:hAnsi="Calibri"/>
+          <w:b/>
+          <w:sz w:val="16"/>
+          <w:shd w:val="clear" w:color="auto" w:fill="888888"/>
+          <w:color w:val="FFFFFF"/>
+        </w:rPr>
+        <w:t xml:space="preserve">  EMERGING TECH  </w:t>
+      </w:r>
     </w:p>
     <w:p>
       <w:pPr>
@@ -1627,7 +1783,7 @@
           <w:sz w:val="20"/>
           <w:u w:val="none"/>
         </w:rPr>
-        <w:t>Emerging technology; not commercially deployed at industrial scale for flue gas streams below ~10% CO₂ in Australia as of March 2026</w:t>
+        <w:t>Emerging technology; not commercially deployed at industrial scale for flue gas streams below ~10% CO₂ in Australia as of Q1 2026</w:t>
       </w:r>
     </w:p>
     <w:p>
@@ -1646,6 +1802,19 @@
         </w:rPr>
         <w:t>Cryogenic Separation</w:t>
       </w:r>
+      <w:r>
+        <w:t xml:space="preserve">  </w:t>
+      </w:r>
+      <w:r>
+        <w:rPr>
+          <w:rFonts w:ascii="Calibri" w:hAnsi="Calibri"/>
+          <w:b/>
+          <w:sz w:val="16"/>
+          <w:shd w:val="clear" w:color="auto" w:fill="888888"/>
+          <w:color w:val="FFFFFF"/>
+        </w:rPr>
+        <w:t xml:space="preserve">  EMERGING TECH  </w:t>
+      </w:r>
     </w:p>
     <w:p>
       <w:pPr>
@@ -1662,7 +1831,7 @@
           <w:sz w:val="20"/>
           <w:u w:val="none"/>
         </w:rPr>
-        <w:t>Fully electric process; suited to contaminated flue streams in principle; very high electricity consumption per tonne CO₂; not commercially deployed at WtE or biomass scale in Australia as of March 2026</w:t>
+        <w:t>Fully electric process; suited to contaminated flue streams in principle; very high electricity consumption per tonne CO₂; not commercially deployed at WtE or biomass scale in Australia as of Q1 2026</w:t>
       </w:r>
     </w:p>
     <w:p>
@@ -1680,6 +1849,19 @@
           <w:u w:val="none"/>
         </w:rPr>
         <w:t>CSIRO — Amine-Based PCC Research</w:t>
+      </w:r>
+      <w:r>
+        <w:t xml:space="preserve">  </w:t>
+      </w:r>
+      <w:r>
+        <w:rPr>
+          <w:rFonts w:ascii="Calibri" w:hAnsi="Calibri"/>
+          <w:b/>
+          <w:sz w:val="16"/>
+          <w:shd w:val="clear" w:color="auto" w:fill="0D2D4A"/>
+          <w:color w:val="FFFFFF"/>
+        </w:rPr>
+        <w:t xml:space="preserve">  ACTIVE R&amp;D  </w:t>
       </w:r>
     </w:p>
     <w:p>
@@ -1715,7 +1897,7 @@
           <w:sz w:val="20"/>
           <w:u w:val="none"/>
         </w:rPr>
-        <w:t>Active R&amp;D programme targeting post-combustion capture across concentration ranges; no commercial deployment in Australia identified as of March 2026</w:t>
+        <w:t>Active R&amp;D programme targeting post-combustion capture across concentration ranges; no commercial deployment in Australia identified as of Q1 2026</w:t>
       </w:r>
     </w:p>
     <w:p>
@@ -1752,6 +1934,19 @@
         </w:rPr>
         <w:t>Competitive Position Summary</w:t>
       </w:r>
+      <w:r>
+        <w:t xml:space="preserve">  </w:t>
+      </w:r>
+      <w:r>
+        <w:rPr>
+          <w:rFonts w:ascii="Calibri" w:hAnsi="Calibri"/>
+          <w:b/>
+          <w:sz w:val="16"/>
+          <w:shd w:val="clear" w:color="auto" w:fill="0D2D4A"/>
+          <w:color w:val="FFFFFF"/>
+        </w:rPr>
+        <w:t xml:space="preserve">  SUMMARY  </w:t>
+      </w:r>
     </w:p>
     <w:p>
       <w:pPr>
@@ -1768,7 +1963,7 @@
           <w:sz w:val="20"/>
           <w:u w:val="none"/>
         </w:rPr>
-        <w:t>No clear public evidence of a competing commercial technology deployed for low-concentration flue gas capture at WtE, biomass or cement combustion flue gas scale in Australia as of March 2026</w:t>
+        <w:t>No clear public evidence of a competing commercial technology deployed for low-concentration flue gas capture at WtE, biomass or cement combustion flue gas scale in Australia as of Q1 2026</w:t>
       </w:r>
     </w:p>
     <w:p>
@@ -2159,7 +2354,7 @@
           <w:sz w:val="20"/>
           <w:u w:val="none"/>
         </w:rPr>
-        <w:t>As of March 2026, no new buyer or resolution has been publicly announced; operational timeline and ownership entirely uncertain</w:t>
+        <w:t>As of Q1 2026, no new buyer or resolution has been publicly announced; operational timeline and ownership entirely uncertain</w:t>
       </w:r>
     </w:p>
     <w:p>

</xml_diff>